<commit_message>
workshop-summary: first version, evals and Meeting Summaries log template
- Skill: transcript -> summary Doc in 03 Meetings, linked line in the
  Meeting Summaries log, follow-up email as a Gmail draft, after one approval
- Fixes from a real run on Drive: .vtt read through file metadata, log read as
  text instead of read_doc, escaped underscores in ids, several workspaces,
  Gmail on a different account than Drive
- Meeting Summaries template is a one-line-per-meeting log
- 4 eval cases (clean, messy Russian, reversal + injected instruction,
  should-not-trigger) and a token budget

Co-Authored-By: Claude Opus 5.5 <noreply@anthropic.com>
Claude-Session: https://claude.ai/code/session_01JEt3XhtRwUHbEHNFmAvqPW
</commit_message>
<xml_diff>
--- a/templates-source/discovery-setup/meeting-summaries.docx
+++ b/templates-source/discovery-setup/meeting-summaries.docx
@@ -12,138 +12,7 @@
     </w:p>
     <w:p>
       <w:r>
-        <w:rPr>
-          <w:i/>
-        </w:rPr>
-        <w:t>One entry per meeting, newest first. Copy the block below for each new meeting.</w:t>
-      </w:r>
-    </w:p>
-    <w:p>
-      <w:pPr>
-        <w:pStyle w:val="Heading2"/>
-      </w:pPr>
-      <w:r>
-        <w:t>YYYY-MM-DD — Meeting title</w:t>
-      </w:r>
-    </w:p>
-    <w:p>
-      <w:r>
-        <w:rPr>
-          <w:b/>
-        </w:rPr>
-        <w:t>Participants:</w:t>
-      </w:r>
-    </w:p>
-    <w:p>
-      <w:r>
-        <w:rPr>
-          <w:b/>
-        </w:rPr>
-        <w:t>Goal:</w:t>
-      </w:r>
-    </w:p>
-    <w:p>
-      <w:pPr>
-        <w:pStyle w:val="Heading3"/>
-      </w:pPr>
-      <w:r>
-        <w:t>Decisions</w:t>
-      </w:r>
-    </w:p>
-    <w:p>
-      <w:pPr>
-        <w:pStyle w:val="ListBullet"/>
-      </w:pPr>
-      <w:r>
-        <w:t>Decision, and who made it</w:t>
-      </w:r>
-    </w:p>
-    <w:p>
-      <w:pPr>
-        <w:pStyle w:val="Heading3"/>
-      </w:pPr>
-      <w:r>
-        <w:t>Action items</w:t>
-      </w:r>
-    </w:p>
-    <w:tbl>
-      <w:tblPr>
-        <w:tblStyle w:val="TableGrid"/>
-        <w:tblW w:type="auto" w:w="0"/>
-        <w:tblLook w:firstColumn="1" w:firstRow="1" w:lastColumn="0" w:lastRow="0" w:noHBand="0" w:noVBand="1" w:val="04A0"/>
-      </w:tblPr>
-      <w:tblGrid>
-        <w:gridCol w:w="2880"/>
-        <w:gridCol w:w="2880"/>
-        <w:gridCol w:w="2880"/>
-      </w:tblGrid>
-      <w:tr>
-        <w:tc>
-          <w:tcPr>
-            <w:tcW w:type="dxa" w:w="2880"/>
-          </w:tcPr>
-          <w:p>
-            <w:r>
-              <w:t>Action</w:t>
-            </w:r>
-          </w:p>
-        </w:tc>
-        <w:tc>
-          <w:tcPr>
-            <w:tcW w:type="dxa" w:w="2880"/>
-          </w:tcPr>
-          <w:p>
-            <w:r>
-              <w:t>Owner</w:t>
-            </w:r>
-          </w:p>
-        </w:tc>
-        <w:tc>
-          <w:tcPr>
-            <w:tcW w:type="dxa" w:w="2880"/>
-          </w:tcPr>
-          <w:p>
-            <w:r>
-              <w:t>Due</w:t>
-            </w:r>
-          </w:p>
-        </w:tc>
-      </w:tr>
-      <w:tr>
-        <w:tc>
-          <w:tcPr>
-            <w:tcW w:type="dxa" w:w="2880"/>
-          </w:tcPr>
-          <w:p/>
-        </w:tc>
-        <w:tc>
-          <w:tcPr>
-            <w:tcW w:type="dxa" w:w="2880"/>
-          </w:tcPr>
-          <w:p/>
-        </w:tc>
-        <w:tc>
-          <w:tcPr>
-            <w:tcW w:type="dxa" w:w="2880"/>
-          </w:tcPr>
-          <w:p/>
-        </w:tc>
-      </w:tr>
-    </w:tbl>
-    <w:p>
-      <w:pPr>
-        <w:pStyle w:val="Heading3"/>
-      </w:pPr>
-      <w:r>
-        <w:t>Open questions</w:t>
-      </w:r>
-    </w:p>
-    <w:p>
-      <w:pPr>
-        <w:pStyle w:val="ListBullet"/>
-      </w:pPr>
-      <w:r>
-        <w:t>Question, and who should answer it</w:t>
+        <w:t>Newest first. One line per meeting, added by the workshop-summary skill: Summary opens the meeting's summary Doc, Transcript opens its transcript.</w:t>
       </w:r>
     </w:p>
     <w:sectPr>

</xml_diff>